<commit_message>
docs: add metric type rules to platform plan and guidelines
Co-authored-by: Ashleymmy <Ashleymmy@users.noreply.github.com>
</commit_message>
<xml_diff>
--- a/docs/规范/OPC体验与开发规范.docx
+++ b/docs/规范/OPC体验与开发规范.docx
@@ -298,6 +298,45 @@
                 <w:sz w:val="18"/>
               </w:rPr>
               <w:t>分析过程面板和多维表格的视觉与交互参照</w:t>
+            </w:r>
+          </w:p>
+        </w:tc>
+      </w:tr>
+      <w:tr>
+        <w:tc>
+          <w:tcPr>
+            <w:tcW w:type="dxa" w:w="4986"/>
+          </w:tcPr>
+          <w:p>
+            <w:r>
+              <w:rPr>
+                <w:sz w:val="18"/>
+              </w:rPr>
+            </w:r>
+            <w:r>
+              <w:rPr>
+                <w:rFonts w:ascii="Consolas" w:hAnsi="Consolas"/>
+                <w:sz w:val="18"/>
+              </w:rPr>
+              <w:t>改造/知乎拉新拉活改造分工与衔接计划_2026-10-08.md</w:t>
+            </w:r>
+          </w:p>
+        </w:tc>
+        <w:tc>
+          <w:tcPr>
+            <w:tcW w:type="dxa" w:w="4986"/>
+          </w:tcPr>
+          <w:p>
+            <w:r>
+              <w:rPr>
+                <w:sz w:val="18"/>
+              </w:rPr>
+            </w:r>
+            <w:r>
+              <w:rPr>
+                <w:sz w:val="18"/>
+              </w:rPr>
+              <w:t>拉新、拉活两类业绩的业务背景和展示分工</w:t>
             </w:r>
           </w:p>
         </w:tc>
@@ -1318,6 +1357,68 @@
       </w:r>
       <w:r>
         <w:t>（与平台方案 3.1 节一致）：项目、渠道、任务、作品、业绩、收益、提现、执行人、团长、达人、独立达人、单价、团队分成。</w:t>
+      </w:r>
+    </w:p>
+    <w:p>
+      <w:r>
+        <w:rPr>
+          <w:b/>
+        </w:rPr>
+        <w:t>业绩类型</w:t>
+      </w:r>
+      <w:r>
+        <w:t>：同一项目可以有多种业绩类型，各自计量、各自计价，不能相加成一个数量。知乎目前有两种：</w:t>
+      </w:r>
+      <w:r>
+        <w:rPr>
+          <w:b/>
+        </w:rPr>
+        <w:t>拉新</w:t>
+      </w:r>
+      <w:r>
+        <w:t>（订单量，单位“单”）和</w:t>
+      </w:r>
+      <w:r>
+        <w:rPr>
+          <w:b/>
+        </w:rPr>
+        <w:t>拉活</w:t>
+      </w:r>
+      <w:r>
+        <w:t>（拉活量，单位“个”）。规则如下：</w:t>
+      </w:r>
+    </w:p>
+    <w:p>
+      <w:pPr>
+        <w:pStyle w:val="ListBullet"/>
+      </w:pPr>
+      <w:r>
+        <w:t>类型来自数据源本身（上传前的类型选择 + 表头核对），</w:t>
+      </w:r>
+      <w:r>
+        <w:rPr>
+          <w:b/>
+        </w:rPr>
+        <w:t>前端不按价格、文件名、角色猜测类型</w:t>
+      </w:r>
+      <w:r>
+        <w:t>，也不在客户端计算金额。</w:t>
+      </w:r>
+    </w:p>
+    <w:p>
+      <w:pPr>
+        <w:pStyle w:val="ListBullet"/>
+      </w:pPr>
+      <w:r>
+        <w:t>同一天同一关键词的不同类型业绩是两条独立数据，不互相覆盖。</w:t>
+      </w:r>
+    </w:p>
+    <w:p>
+      <w:pPr>
+        <w:pStyle w:val="ListBullet"/>
+      </w:pPr>
+      <w:r>
+        <w:t>页面上凡是出现数量和金额，都要标明类型；汇总时分类型显示，再给出金额合计。</w:t>
       </w:r>
     </w:p>
     <w:p>

</xml_diff>

<commit_message>
docs: record confirmed activation pricing and history decisions
Co-authored-by: Ashleymmy <Ashleymmy@users.noreply.github.com>
</commit_message>
<xml_diff>
--- a/docs/规范/OPC体验与开发规范.docx
+++ b/docs/规范/OPC体验与开发规范.docx
@@ -136,6 +136,45 @@
                 <w:sz w:val="18"/>
               </w:rPr>
               <w:t>必须遵守的规则摘要</w:t>
+            </w:r>
+          </w:p>
+        </w:tc>
+      </w:tr>
+      <w:tr>
+        <w:tc>
+          <w:tcPr>
+            <w:tcW w:type="dxa" w:w="4986"/>
+          </w:tcPr>
+          <w:p>
+            <w:r>
+              <w:rPr>
+                <w:sz w:val="18"/>
+              </w:rPr>
+            </w:r>
+            <w:r>
+              <w:rPr>
+                <w:rFonts w:ascii="Consolas" w:hAnsi="Consolas"/>
+                <w:sz w:val="18"/>
+              </w:rPr>
+              <w:t>改造/Codex实施任务书_报表归因与拉新拉活_2026-10-08.md</w:t>
+            </w:r>
+          </w:p>
+        </w:tc>
+        <w:tc>
+          <w:tcPr>
+            <w:tcW w:type="dxa" w:w="4986"/>
+          </w:tcPr>
+          <w:p>
+            <w:r>
+              <w:rPr>
+                <w:sz w:val="18"/>
+              </w:rPr>
+            </w:r>
+            <w:r>
+              <w:rPr>
+                <w:sz w:val="18"/>
+              </w:rPr>
+              <w:t>当前要实施的任务清单（已确认）；与方案文档冲突时以任务书为准</w:t>
             </w:r>
           </w:p>
         </w:tc>

</xml_diff>

<commit_message>
docs: reconcile proposals with confirmed decisions and fix setup instructions
Co-authored-by: Ashleymmy <Ashleymmy@users.noreply.github.com>
</commit_message>
<xml_diff>
--- a/docs/规范/OPC体验与开发规范.docx
+++ b/docs/规范/OPC体验与开发规范.docx
@@ -3808,9 +3808,13 @@
           <w:rFonts w:ascii="Consolas" w:hAnsi="Consolas"/>
           <w:sz w:val="17"/>
         </w:rPr>
-        <w:t># 依赖：MySQL 8、Redis 7（本机或 Docker 均可）</w:t>
+        <w:t># 依赖：MySQL 8、Redis 7（本机或 Docker 均可）。先按 .env.example 中的 DB_* 建库和用户，例如：</w:t>
         <w:br/>
-        <w:t>cp server/.env.example server/.env    # 设置 DB_*、REDIS_URL、OPC_MODULES=zhihu、ZHIHU_API_BASE=https://open.zhihu.com</w:t>
+        <w:t>#   CREATE DATABASE zhihu_koc CHARACTER SET utf8mb4 COLLATE utf8mb4_unicode_ci;</w:t>
+        <w:br/>
+        <w:t>#   CREATE USER 'zhihu'@'127.0.0.1' IDENTIFIED BY 'zhihu_local_password'; GRANT ALL ON zhihu_koc.* TO 'zhihu'@'127.0.0.1';</w:t>
+        <w:br/>
+        <w:t>cp server/.env.example server/.env    # 把 OPC_MODULES 改成 zhihu，其余可保持默认</w:t>
         <w:br/>
         <w:t>cd server &amp;&amp; npm ci &amp;&amp; npm run migrate &amp;&amp; ADMIN_PASSWORD='Admin123456!' npm run bootstrap:admin</w:t>
         <w:br/>
@@ -3881,17 +3885,7 @@
         <w:t>Review123456</w:t>
       </w:r>
       <w:r>
-        <w:t xml:space="preserve">。首次登录要求改密码时，可在数据库执行 </w:t>
-      </w:r>
-      <w:r>
-        <w:rPr>
-          <w:rFonts w:ascii="Consolas" w:hAnsi="Consolas"/>
-          <w:sz w:val="19"/>
-        </w:rPr>
-        <w:t>UPDATE users SET must_change_pwd=0</w:t>
-      </w:r>
-      <w:r>
-        <w:t>。演示数据只能写入本地库，脚本会拒绝在生产环境运行。</w:t>
+        <w:t>。脚本会自动取消这些账号的首次改密码要求。演示数据只在刚初始化的空库（只有管理员一个账号）上写入；再次运行只启动服务、不重复写入。脚本拒绝在生产环境运行。</w:t>
       </w:r>
     </w:p>
     <w:p>

</xml_diff>